<commit_message>
Jupyter Notebook NUMPY INtro
</commit_message>
<xml_diff>
--- a/Croma Campus  Notes Python.docx
+++ b/Croma Campus  Notes Python.docx
@@ -27719,8 +27719,6 @@
       <w:pPr>
         <w:pStyle w:val="NoSpacing"/>
       </w:pPr>
-      <w:bookmarkStart w:id="0" w:name="_GoBack"/>
-      <w:bookmarkEnd w:id="0"/>
     </w:p>
     <w:p>
       <w:pPr>
@@ -27838,6 +27836,185 @@
       <w:pPr>
         <w:pStyle w:val="NoSpacing"/>
       </w:pPr>
+    </w:p>
+    <w:p>
+      <w:pPr>
+        <w:pStyle w:val="NoSpacing"/>
+        <w:rPr>
+          <w:sz w:val="36"/>
+          <w:szCs w:val="36"/>
+        </w:rPr>
+      </w:pPr>
+    </w:p>
+    <w:p>
+      <w:pPr>
+        <w:pStyle w:val="NoSpacing"/>
+        <w:rPr>
+          <w:b/>
+          <w:sz w:val="36"/>
+          <w:szCs w:val="36"/>
+        </w:rPr>
+      </w:pPr>
+      <w:r>
+        <w:rPr>
+          <w:b/>
+          <w:sz w:val="36"/>
+          <w:szCs w:val="36"/>
+        </w:rPr>
+        <w:t>NUMPY</w:t>
+      </w:r>
+      <w:r>
+        <w:rPr>
+          <w:b/>
+          <w:sz w:val="36"/>
+          <w:szCs w:val="36"/>
+        </w:rPr>
+        <w:t xml:space="preserve"> (pip install numpy)</w:t>
+      </w:r>
+    </w:p>
+    <w:p>
+      <w:pPr>
+        <w:pStyle w:val="NoSpacing"/>
+        <w:numPr>
+          <w:ilvl w:val="0"/>
+          <w:numId w:val="6"/>
+        </w:numPr>
+      </w:pPr>
+      <w:r>
+        <w:t xml:space="preserve">NUMPY is used to create an Array </w:t>
+      </w:r>
+    </w:p>
+    <w:p>
+      <w:pPr>
+        <w:pStyle w:val="NoSpacing"/>
+        <w:numPr>
+          <w:ilvl w:val="0"/>
+          <w:numId w:val="6"/>
+        </w:numPr>
+      </w:pPr>
+      <w:r>
+        <w:t>Numerical in python(it is very strong and Powerfull library for numerical calculation )</w:t>
+      </w:r>
+    </w:p>
+    <w:p>
+      <w:pPr>
+        <w:pStyle w:val="NoSpacing"/>
+        <w:ind w:left="720"/>
+      </w:pPr>
+    </w:p>
+    <w:p>
+      <w:pPr>
+        <w:pStyle w:val="NoSpacing"/>
+        <w:ind w:left="360"/>
+        <w:rPr>
+          <w:b/>
+          <w:sz w:val="28"/>
+          <w:szCs w:val="28"/>
+        </w:rPr>
+      </w:pPr>
+      <w:r>
+        <w:rPr>
+          <w:b/>
+          <w:sz w:val="28"/>
+          <w:szCs w:val="28"/>
+        </w:rPr>
+        <w:t>Array</w:t>
+      </w:r>
+    </w:p>
+    <w:p>
+      <w:pPr>
+        <w:pStyle w:val="ListParagraph"/>
+        <w:numPr>
+          <w:ilvl w:val="0"/>
+          <w:numId w:val="6"/>
+        </w:numPr>
+      </w:pPr>
+      <w:r>
+        <w:t xml:space="preserve">Array is the collection of similar type lof data Type </w:t>
+      </w:r>
+    </w:p>
+    <w:p>
+      <w:pPr>
+        <w:pStyle w:val="ListParagraph"/>
+        <w:numPr>
+          <w:ilvl w:val="0"/>
+          <w:numId w:val="6"/>
+        </w:numPr>
+      </w:pPr>
+      <w:r>
+        <w:t>Array is the collection of homogenous datatype</w:t>
+      </w:r>
+    </w:p>
+    <w:p>
+      <w:pPr>
+        <w:pStyle w:val="ListParagraph"/>
+        <w:numPr>
+          <w:ilvl w:val="0"/>
+          <w:numId w:val="6"/>
+        </w:numPr>
+      </w:pPr>
+      <w:r>
+        <w:t xml:space="preserve">Array is faster then List </w:t>
+      </w:r>
+    </w:p>
+    <w:p>
+      <w:pPr>
+        <w:pStyle w:val="ListParagraph"/>
+        <w:numPr>
+          <w:ilvl w:val="0"/>
+          <w:numId w:val="6"/>
+        </w:numPr>
+      </w:pPr>
+      <w:r>
+        <w:t xml:space="preserve">Formulla </w:t>
+      </w:r>
+      <w:r>
+        <w:sym w:font="Wingdings" w:char="F0E8"/>
+      </w:r>
+      <w:r>
+        <w:t xml:space="preserve"> ( </w:t>
+      </w:r>
+      <w:r>
+        <w:t>starting element address  , bit size (int , string) , index(konse index ka data print krvana hai )</w:t>
+      </w:r>
+      <w:r>
+        <w:t>)</w:t>
+      </w:r>
+    </w:p>
+    <w:p>
+      <w:pPr>
+        <w:pStyle w:val="ListParagraph"/>
+        <w:numPr>
+          <w:ilvl w:val="0"/>
+          <w:numId w:val="6"/>
+        </w:numPr>
+      </w:pPr>
+      <w:r>
+        <w:t xml:space="preserve">It based on the concept of </w:t>
+      </w:r>
+      <w:r>
+        <w:rPr>
+          <w:b/>
+        </w:rPr>
+        <w:t xml:space="preserve">contiguous memory </w:t>
+      </w:r>
+      <w:r>
+        <w:rPr>
+          <w:b/>
+        </w:rPr>
+        <w:t xml:space="preserve">means </w:t>
+      </w:r>
+      <w:r>
+        <w:rPr>
+          <w:b/>
+        </w:rPr>
+        <w:sym w:font="Wingdings" w:char="F0E8"/>
+      </w:r>
+      <w:r>
+        <w:t xml:space="preserve"> array works on contiguous memory unlike list (list works on random memory)</w:t>
+      </w:r>
+      <w:bookmarkStart w:id="0" w:name="_GoBack"/>
+      <w:bookmarkEnd w:id="0"/>
     </w:p>
     <w:sectPr>
       <w:pgSz w:w="15840" w:h="24480" w:code="3"/>
@@ -28191,122 +28368,9 @@
     </w:lvl>
   </w:abstractNum>
   <w:abstractNum w:abstractNumId="3" w15:restartNumberingAfterBreak="0">
-    <w:nsid w:val="52F004D3"/>
-    <w:multiLevelType w:val="multilevel"/>
-    <w:tmpl w:val="84FE70EA"/>
-    <w:lvl w:ilvl="0">
-      <w:start w:val="1"/>
-      <w:numFmt w:val="decimal"/>
-      <w:lvlText w:val="%1."/>
-      <w:lvlJc w:val="left"/>
-      <w:pPr>
-        <w:tabs>
-          <w:tab w:val="num" w:pos="720"/>
-        </w:tabs>
-        <w:ind w:left="720" w:hanging="360"/>
-      </w:pPr>
-    </w:lvl>
-    <w:lvl w:ilvl="1" w:tentative="1">
-      <w:start w:val="1"/>
-      <w:numFmt w:val="decimal"/>
-      <w:lvlText w:val="%2."/>
-      <w:lvlJc w:val="left"/>
-      <w:pPr>
-        <w:tabs>
-          <w:tab w:val="num" w:pos="1440"/>
-        </w:tabs>
-        <w:ind w:left="1440" w:hanging="360"/>
-      </w:pPr>
-    </w:lvl>
-    <w:lvl w:ilvl="2" w:tentative="1">
-      <w:start w:val="1"/>
-      <w:numFmt w:val="decimal"/>
-      <w:lvlText w:val="%3."/>
-      <w:lvlJc w:val="left"/>
-      <w:pPr>
-        <w:tabs>
-          <w:tab w:val="num" w:pos="2160"/>
-        </w:tabs>
-        <w:ind w:left="2160" w:hanging="360"/>
-      </w:pPr>
-    </w:lvl>
-    <w:lvl w:ilvl="3" w:tentative="1">
-      <w:start w:val="1"/>
-      <w:numFmt w:val="decimal"/>
-      <w:lvlText w:val="%4."/>
-      <w:lvlJc w:val="left"/>
-      <w:pPr>
-        <w:tabs>
-          <w:tab w:val="num" w:pos="2880"/>
-        </w:tabs>
-        <w:ind w:left="2880" w:hanging="360"/>
-      </w:pPr>
-    </w:lvl>
-    <w:lvl w:ilvl="4" w:tentative="1">
-      <w:start w:val="1"/>
-      <w:numFmt w:val="decimal"/>
-      <w:lvlText w:val="%5."/>
-      <w:lvlJc w:val="left"/>
-      <w:pPr>
-        <w:tabs>
-          <w:tab w:val="num" w:pos="3600"/>
-        </w:tabs>
-        <w:ind w:left="3600" w:hanging="360"/>
-      </w:pPr>
-    </w:lvl>
-    <w:lvl w:ilvl="5" w:tentative="1">
-      <w:start w:val="1"/>
-      <w:numFmt w:val="decimal"/>
-      <w:lvlText w:val="%6."/>
-      <w:lvlJc w:val="left"/>
-      <w:pPr>
-        <w:tabs>
-          <w:tab w:val="num" w:pos="4320"/>
-        </w:tabs>
-        <w:ind w:left="4320" w:hanging="360"/>
-      </w:pPr>
-    </w:lvl>
-    <w:lvl w:ilvl="6" w:tentative="1">
-      <w:start w:val="1"/>
-      <w:numFmt w:val="decimal"/>
-      <w:lvlText w:val="%7."/>
-      <w:lvlJc w:val="left"/>
-      <w:pPr>
-        <w:tabs>
-          <w:tab w:val="num" w:pos="5040"/>
-        </w:tabs>
-        <w:ind w:left="5040" w:hanging="360"/>
-      </w:pPr>
-    </w:lvl>
-    <w:lvl w:ilvl="7" w:tentative="1">
-      <w:start w:val="1"/>
-      <w:numFmt w:val="decimal"/>
-      <w:lvlText w:val="%8."/>
-      <w:lvlJc w:val="left"/>
-      <w:pPr>
-        <w:tabs>
-          <w:tab w:val="num" w:pos="5760"/>
-        </w:tabs>
-        <w:ind w:left="5760" w:hanging="360"/>
-      </w:pPr>
-    </w:lvl>
-    <w:lvl w:ilvl="8" w:tentative="1">
-      <w:start w:val="1"/>
-      <w:numFmt w:val="decimal"/>
-      <w:lvlText w:val="%9."/>
-      <w:lvlJc w:val="left"/>
-      <w:pPr>
-        <w:tabs>
-          <w:tab w:val="num" w:pos="6480"/>
-        </w:tabs>
-        <w:ind w:left="6480" w:hanging="360"/>
-      </w:pPr>
-    </w:lvl>
-  </w:abstractNum>
-  <w:abstractNum w:abstractNumId="4" w15:restartNumberingAfterBreak="0">
-    <w:nsid w:val="7D0F6DE1"/>
+    <w:nsid w:val="471775BD"/>
     <w:multiLevelType w:val="hybridMultilevel"/>
-    <w:tmpl w:val="479A335E"/>
+    <w:tmpl w:val="271A9436"/>
     <w:lvl w:ilvl="0" w:tplc="04090001">
       <w:start w:val="1"/>
       <w:numFmt w:val="bullet"/>
@@ -28416,20 +28480,249 @@
       </w:rPr>
     </w:lvl>
   </w:abstractNum>
+  <w:abstractNum w:abstractNumId="4" w15:restartNumberingAfterBreak="0">
+    <w:nsid w:val="52F004D3"/>
+    <w:multiLevelType w:val="multilevel"/>
+    <w:tmpl w:val="84FE70EA"/>
+    <w:lvl w:ilvl="0">
+      <w:start w:val="1"/>
+      <w:numFmt w:val="decimal"/>
+      <w:lvlText w:val="%1."/>
+      <w:lvlJc w:val="left"/>
+      <w:pPr>
+        <w:tabs>
+          <w:tab w:val="num" w:pos="720"/>
+        </w:tabs>
+        <w:ind w:left="720" w:hanging="360"/>
+      </w:pPr>
+    </w:lvl>
+    <w:lvl w:ilvl="1" w:tentative="1">
+      <w:start w:val="1"/>
+      <w:numFmt w:val="decimal"/>
+      <w:lvlText w:val="%2."/>
+      <w:lvlJc w:val="left"/>
+      <w:pPr>
+        <w:tabs>
+          <w:tab w:val="num" w:pos="1440"/>
+        </w:tabs>
+        <w:ind w:left="1440" w:hanging="360"/>
+      </w:pPr>
+    </w:lvl>
+    <w:lvl w:ilvl="2" w:tentative="1">
+      <w:start w:val="1"/>
+      <w:numFmt w:val="decimal"/>
+      <w:lvlText w:val="%3."/>
+      <w:lvlJc w:val="left"/>
+      <w:pPr>
+        <w:tabs>
+          <w:tab w:val="num" w:pos="2160"/>
+        </w:tabs>
+        <w:ind w:left="2160" w:hanging="360"/>
+      </w:pPr>
+    </w:lvl>
+    <w:lvl w:ilvl="3" w:tentative="1">
+      <w:start w:val="1"/>
+      <w:numFmt w:val="decimal"/>
+      <w:lvlText w:val="%4."/>
+      <w:lvlJc w:val="left"/>
+      <w:pPr>
+        <w:tabs>
+          <w:tab w:val="num" w:pos="2880"/>
+        </w:tabs>
+        <w:ind w:left="2880" w:hanging="360"/>
+      </w:pPr>
+    </w:lvl>
+    <w:lvl w:ilvl="4" w:tentative="1">
+      <w:start w:val="1"/>
+      <w:numFmt w:val="decimal"/>
+      <w:lvlText w:val="%5."/>
+      <w:lvlJc w:val="left"/>
+      <w:pPr>
+        <w:tabs>
+          <w:tab w:val="num" w:pos="3600"/>
+        </w:tabs>
+        <w:ind w:left="3600" w:hanging="360"/>
+      </w:pPr>
+    </w:lvl>
+    <w:lvl w:ilvl="5" w:tentative="1">
+      <w:start w:val="1"/>
+      <w:numFmt w:val="decimal"/>
+      <w:lvlText w:val="%6."/>
+      <w:lvlJc w:val="left"/>
+      <w:pPr>
+        <w:tabs>
+          <w:tab w:val="num" w:pos="4320"/>
+        </w:tabs>
+        <w:ind w:left="4320" w:hanging="360"/>
+      </w:pPr>
+    </w:lvl>
+    <w:lvl w:ilvl="6" w:tentative="1">
+      <w:start w:val="1"/>
+      <w:numFmt w:val="decimal"/>
+      <w:lvlText w:val="%7."/>
+      <w:lvlJc w:val="left"/>
+      <w:pPr>
+        <w:tabs>
+          <w:tab w:val="num" w:pos="5040"/>
+        </w:tabs>
+        <w:ind w:left="5040" w:hanging="360"/>
+      </w:pPr>
+    </w:lvl>
+    <w:lvl w:ilvl="7" w:tentative="1">
+      <w:start w:val="1"/>
+      <w:numFmt w:val="decimal"/>
+      <w:lvlText w:val="%8."/>
+      <w:lvlJc w:val="left"/>
+      <w:pPr>
+        <w:tabs>
+          <w:tab w:val="num" w:pos="5760"/>
+        </w:tabs>
+        <w:ind w:left="5760" w:hanging="360"/>
+      </w:pPr>
+    </w:lvl>
+    <w:lvl w:ilvl="8" w:tentative="1">
+      <w:start w:val="1"/>
+      <w:numFmt w:val="decimal"/>
+      <w:lvlText w:val="%9."/>
+      <w:lvlJc w:val="left"/>
+      <w:pPr>
+        <w:tabs>
+          <w:tab w:val="num" w:pos="6480"/>
+        </w:tabs>
+        <w:ind w:left="6480" w:hanging="360"/>
+      </w:pPr>
+    </w:lvl>
+  </w:abstractNum>
+  <w:abstractNum w:abstractNumId="5" w15:restartNumberingAfterBreak="0">
+    <w:nsid w:val="7D0F6DE1"/>
+    <w:multiLevelType w:val="hybridMultilevel"/>
+    <w:tmpl w:val="479A335E"/>
+    <w:lvl w:ilvl="0" w:tplc="04090001">
+      <w:start w:val="1"/>
+      <w:numFmt w:val="bullet"/>
+      <w:lvlText w:val=""/>
+      <w:lvlJc w:val="left"/>
+      <w:pPr>
+        <w:ind w:left="720" w:hanging="360"/>
+      </w:pPr>
+      <w:rPr>
+        <w:rFonts w:ascii="Symbol" w:hAnsi="Symbol" w:hint="default"/>
+      </w:rPr>
+    </w:lvl>
+    <w:lvl w:ilvl="1" w:tplc="04090003" w:tentative="1">
+      <w:start w:val="1"/>
+      <w:numFmt w:val="bullet"/>
+      <w:lvlText w:val="o"/>
+      <w:lvlJc w:val="left"/>
+      <w:pPr>
+        <w:ind w:left="1440" w:hanging="360"/>
+      </w:pPr>
+      <w:rPr>
+        <w:rFonts w:ascii="Courier New" w:hAnsi="Courier New" w:cs="Courier New" w:hint="default"/>
+      </w:rPr>
+    </w:lvl>
+    <w:lvl w:ilvl="2" w:tplc="04090005" w:tentative="1">
+      <w:start w:val="1"/>
+      <w:numFmt w:val="bullet"/>
+      <w:lvlText w:val=""/>
+      <w:lvlJc w:val="left"/>
+      <w:pPr>
+        <w:ind w:left="2160" w:hanging="360"/>
+      </w:pPr>
+      <w:rPr>
+        <w:rFonts w:ascii="Wingdings" w:hAnsi="Wingdings" w:hint="default"/>
+      </w:rPr>
+    </w:lvl>
+    <w:lvl w:ilvl="3" w:tplc="04090001" w:tentative="1">
+      <w:start w:val="1"/>
+      <w:numFmt w:val="bullet"/>
+      <w:lvlText w:val=""/>
+      <w:lvlJc w:val="left"/>
+      <w:pPr>
+        <w:ind w:left="2880" w:hanging="360"/>
+      </w:pPr>
+      <w:rPr>
+        <w:rFonts w:ascii="Symbol" w:hAnsi="Symbol" w:hint="default"/>
+      </w:rPr>
+    </w:lvl>
+    <w:lvl w:ilvl="4" w:tplc="04090003" w:tentative="1">
+      <w:start w:val="1"/>
+      <w:numFmt w:val="bullet"/>
+      <w:lvlText w:val="o"/>
+      <w:lvlJc w:val="left"/>
+      <w:pPr>
+        <w:ind w:left="3600" w:hanging="360"/>
+      </w:pPr>
+      <w:rPr>
+        <w:rFonts w:ascii="Courier New" w:hAnsi="Courier New" w:cs="Courier New" w:hint="default"/>
+      </w:rPr>
+    </w:lvl>
+    <w:lvl w:ilvl="5" w:tplc="04090005" w:tentative="1">
+      <w:start w:val="1"/>
+      <w:numFmt w:val="bullet"/>
+      <w:lvlText w:val=""/>
+      <w:lvlJc w:val="left"/>
+      <w:pPr>
+        <w:ind w:left="4320" w:hanging="360"/>
+      </w:pPr>
+      <w:rPr>
+        <w:rFonts w:ascii="Wingdings" w:hAnsi="Wingdings" w:hint="default"/>
+      </w:rPr>
+    </w:lvl>
+    <w:lvl w:ilvl="6" w:tplc="04090001" w:tentative="1">
+      <w:start w:val="1"/>
+      <w:numFmt w:val="bullet"/>
+      <w:lvlText w:val=""/>
+      <w:lvlJc w:val="left"/>
+      <w:pPr>
+        <w:ind w:left="5040" w:hanging="360"/>
+      </w:pPr>
+      <w:rPr>
+        <w:rFonts w:ascii="Symbol" w:hAnsi="Symbol" w:hint="default"/>
+      </w:rPr>
+    </w:lvl>
+    <w:lvl w:ilvl="7" w:tplc="04090003" w:tentative="1">
+      <w:start w:val="1"/>
+      <w:numFmt w:val="bullet"/>
+      <w:lvlText w:val="o"/>
+      <w:lvlJc w:val="left"/>
+      <w:pPr>
+        <w:ind w:left="5760" w:hanging="360"/>
+      </w:pPr>
+      <w:rPr>
+        <w:rFonts w:ascii="Courier New" w:hAnsi="Courier New" w:cs="Courier New" w:hint="default"/>
+      </w:rPr>
+    </w:lvl>
+    <w:lvl w:ilvl="8" w:tplc="04090005" w:tentative="1">
+      <w:start w:val="1"/>
+      <w:numFmt w:val="bullet"/>
+      <w:lvlText w:val=""/>
+      <w:lvlJc w:val="left"/>
+      <w:pPr>
+        <w:ind w:left="6480" w:hanging="360"/>
+      </w:pPr>
+      <w:rPr>
+        <w:rFonts w:ascii="Wingdings" w:hAnsi="Wingdings" w:hint="default"/>
+      </w:rPr>
+    </w:lvl>
+  </w:abstractNum>
   <w:num w:numId="1">
-    <w:abstractNumId w:val="3"/>
+    <w:abstractNumId w:val="4"/>
   </w:num>
   <w:num w:numId="2">
     <w:abstractNumId w:val="1"/>
   </w:num>
   <w:num w:numId="3">
-    <w:abstractNumId w:val="4"/>
+    <w:abstractNumId w:val="5"/>
   </w:num>
   <w:num w:numId="4">
     <w:abstractNumId w:val="0"/>
   </w:num>
   <w:num w:numId="5">
     <w:abstractNumId w:val="2"/>
+  </w:num>
+  <w:num w:numId="6">
+    <w:abstractNumId w:val="3"/>
   </w:num>
 </w:numbering>
 </file>
@@ -28937,6 +29230,17 @@
       <w:szCs w:val="24"/>
     </w:rPr>
   </w:style>
+  <w:style w:type="paragraph" w:styleId="ListParagraph">
+    <w:name w:val="List Paragraph"/>
+    <w:basedOn w:val="Normal"/>
+    <w:uiPriority w:val="34"/>
+    <w:qFormat/>
+    <w:rsid w:val="00115D0F"/>
+    <w:pPr>
+      <w:ind w:left="720"/>
+      <w:contextualSpacing/>
+    </w:pPr>
+  </w:style>
 </w:styles>
 </file>
 

</xml_diff>

<commit_message>
0003 REAl WORLD PRACTICE Completed
</commit_message>
<xml_diff>
--- a/Croma Campus  Notes Python.docx
+++ b/Croma Campus  Notes Python.docx
@@ -28380,8 +28380,6 @@
       <w:r>
         <w:t xml:space="preserve"> if column has space like emp name </w:t>
       </w:r>
-      <w:bookmarkStart w:id="0" w:name="_GoBack"/>
-      <w:bookmarkEnd w:id="0"/>
     </w:p>
     <w:p>
       <w:pPr>
@@ -29271,6 +29269,469 @@
         <w:t xml:space="preserve"> it show only these column </w:t>
       </w:r>
     </w:p>
+    <w:p>
+      <w:pPr>
+        <w:pStyle w:val="NoSpacing"/>
+        <w:numPr>
+          <w:ilvl w:val="0"/>
+          <w:numId w:val="9"/>
+        </w:numPr>
+      </w:pPr>
+      <w:r>
+        <w:t>df.columns</w:t>
+      </w:r>
+      <w:r>
+        <w:sym w:font="Wingdings" w:char="F0E8"/>
+      </w:r>
+      <w:r>
+        <w:t xml:space="preserve"> it is used to see all columns</w:t>
+      </w:r>
+    </w:p>
+    <w:p>
+      <w:pPr>
+        <w:pStyle w:val="NoSpacing"/>
+        <w:numPr>
+          <w:ilvl w:val="0"/>
+          <w:numId w:val="9"/>
+        </w:numPr>
+      </w:pPr>
+      <w:r>
+        <w:t>df[columnname].unique()</w:t>
+      </w:r>
+      <w:r>
+        <w:sym w:font="Wingdings" w:char="F0E8"/>
+      </w:r>
+      <w:r>
+        <w:t xml:space="preserve">it is used to see all unique values </w:t>
+      </w:r>
+    </w:p>
+    <w:p>
+      <w:pPr>
+        <w:pStyle w:val="NoSpacing"/>
+        <w:numPr>
+          <w:ilvl w:val="0"/>
+          <w:numId w:val="9"/>
+        </w:numPr>
+      </w:pPr>
+      <w:r>
+        <w:t>df[</w:t>
+      </w:r>
+      <w:r>
+        <w:t>columnname].</w:t>
+      </w:r>
+      <w:r>
+        <w:t xml:space="preserve">value_counts </w:t>
+      </w:r>
+      <w:r>
+        <w:t>()</w:t>
+      </w:r>
+      <w:r>
+        <w:sym w:font="Wingdings" w:char="F0E8"/>
+      </w:r>
+      <w:r>
+        <w:t xml:space="preserve"> it is used to count the number of values comes (means is column mai itne baar ye naam aaya hai )</w:t>
+      </w:r>
+    </w:p>
+    <w:p>
+      <w:pPr>
+        <w:pStyle w:val="NoSpacing"/>
+        <w:numPr>
+          <w:ilvl w:val="0"/>
+          <w:numId w:val="9"/>
+        </w:numPr>
+      </w:pPr>
+      <w:r>
+        <w:t>mode()</w:t>
+      </w:r>
+      <w:r>
+        <w:sym w:font="Wingdings" w:char="F0E8"/>
+      </w:r>
+      <w:r>
+        <w:t xml:space="preserve"> is used to select maximum time element occur</w:t>
+      </w:r>
+    </w:p>
+    <w:p>
+      <w:pPr>
+        <w:pStyle w:val="NoSpacing"/>
+        <w:numPr>
+          <w:ilvl w:val="0"/>
+          <w:numId w:val="9"/>
+        </w:numPr>
+      </w:pPr>
+      <w:r>
+        <w:t>df.select_dtypes(include=str)</w:t>
+      </w:r>
+      <w:r>
+        <w:sym w:font="Wingdings" w:char="F0E8"/>
+      </w:r>
+      <w:r>
+        <w:t xml:space="preserve"> ye vo data dikhayga jo str type ka hai bs</w:t>
+      </w:r>
+    </w:p>
+    <w:p>
+      <w:pPr>
+        <w:pStyle w:val="NoSpacing"/>
+        <w:ind w:left="720"/>
+      </w:pPr>
+      <w:r>
+        <w:drawing>
+          <wp:inline distT="0" distB="0" distL="0" distR="0" wp14:anchorId="6D00F3F3" wp14:editId="73236534">
+            <wp:extent cx="5973009" cy="2029108"/>
+            <wp:effectExtent l="0" t="0" r="8890" b="9525"/>
+            <wp:docPr id="10" name="Picture 10"/>
+            <wp:cNvGraphicFramePr>
+              <a:graphicFrameLocks xmlns:a="http://schemas.openxmlformats.org/drawingml/2006/main" noChangeAspect="1"/>
+            </wp:cNvGraphicFramePr>
+            <a:graphic xmlns:a="http://schemas.openxmlformats.org/drawingml/2006/main">
+              <a:graphicData uri="http://schemas.openxmlformats.org/drawingml/2006/picture">
+                <pic:pic xmlns:pic="http://schemas.openxmlformats.org/drawingml/2006/picture">
+                  <pic:nvPicPr>
+                    <pic:cNvPr id="1" name=""/>
+                    <pic:cNvPicPr/>
+                  </pic:nvPicPr>
+                  <pic:blipFill>
+                    <a:blip r:embed="rId15"/>
+                    <a:stretch>
+                      <a:fillRect/>
+                    </a:stretch>
+                  </pic:blipFill>
+                  <pic:spPr>
+                    <a:xfrm>
+                      <a:off x="0" y="0"/>
+                      <a:ext cx="5973009" cy="2029108"/>
+                    </a:xfrm>
+                    <a:prstGeom prst="rect">
+                      <a:avLst/>
+                    </a:prstGeom>
+                  </pic:spPr>
+                </pic:pic>
+              </a:graphicData>
+            </a:graphic>
+          </wp:inline>
+        </w:drawing>
+      </w:r>
+    </w:p>
+    <w:p>
+      <w:pPr>
+        <w:pStyle w:val="NoSpacing"/>
+        <w:numPr>
+          <w:ilvl w:val="0"/>
+          <w:numId w:val="9"/>
+        </w:numPr>
+      </w:pPr>
+      <w:r>
+        <w:t># it shows mode values comes on index 0</w:t>
+      </w:r>
+    </w:p>
+    <w:p>
+      <w:pPr>
+        <w:pStyle w:val="NoSpacing"/>
+        <w:ind w:left="720"/>
+      </w:pPr>
+      <w:r>
+        <w:t xml:space="preserve">df.Segment.mode() </w:t>
+      </w:r>
+      <w:r>
+        <w:sym w:font="Wingdings" w:char="F0E8"/>
+      </w:r>
+      <w:r>
+        <w:t xml:space="preserve"> </w:t>
+      </w:r>
+      <w:r>
+        <w:t>#it show index</w:t>
+      </w:r>
+    </w:p>
+    <w:p>
+      <w:pPr>
+        <w:pStyle w:val="NoSpacing"/>
+        <w:ind w:left="720"/>
+      </w:pPr>
+      <w:r>
+        <w:t>df.Segment.mode()[0]</w:t>
+      </w:r>
+      <w:r>
+        <w:sym w:font="Wingdings" w:char="F0E8"/>
+      </w:r>
+      <w:r>
+        <w:t xml:space="preserve"> </w:t>
+      </w:r>
+      <w:r>
+        <w:t xml:space="preserve"> #it shows value on index 0</w:t>
+      </w:r>
+    </w:p>
+    <w:p>
+      <w:pPr>
+        <w:pStyle w:val="NoSpacing"/>
+        <w:numPr>
+          <w:ilvl w:val="0"/>
+          <w:numId w:val="9"/>
+        </w:numPr>
+      </w:pPr>
+      <w:r>
+        <w:t>for col in df.sel</w:t>
+      </w:r>
+      <w:r>
+        <w:t xml:space="preserve">ect_dtypes(include = </w:t>
+      </w:r>
+      <w:r>
+        <w:rPr>
+          <w:highlight w:val="yellow"/>
+        </w:rPr>
+        <w:t>np.number</w:t>
+      </w:r>
+      <w:r>
+        <w:t xml:space="preserve">)  </w:t>
+      </w:r>
+      <w:r>
+        <w:sym w:font="Wingdings" w:char="F0E8"/>
+      </w:r>
+      <w:r>
+        <w:t xml:space="preserve"> it select both float and int </w:t>
+      </w:r>
+    </w:p>
+    <w:p>
+      <w:pPr>
+        <w:pStyle w:val="NoSpacing"/>
+        <w:numPr>
+          <w:ilvl w:val="0"/>
+          <w:numId w:val="9"/>
+        </w:numPr>
+      </w:pPr>
+      <w:r>
+        <w:t xml:space="preserve">Lambda function </w:t>
+      </w:r>
+      <w:r>
+        <w:sym w:font="Wingdings" w:char="F0E8"/>
+      </w:r>
+      <w:r>
+        <w:t xml:space="preserve"> </w:t>
+      </w:r>
+      <w:r>
+        <w:t>df['Country'].map(lambda val : val[0:3])</w:t>
+      </w:r>
+    </w:p>
+    <w:p>
+      <w:pPr>
+        <w:pStyle w:val="NoSpacing"/>
+        <w:ind w:left="720"/>
+      </w:pPr>
+      <w:r>
+        <w:drawing>
+          <wp:inline distT="0" distB="0" distL="0" distR="0" wp14:anchorId="336ADB58" wp14:editId="78A30DD5">
+            <wp:extent cx="8345065" cy="3181794"/>
+            <wp:effectExtent l="0" t="0" r="0" b="0"/>
+            <wp:docPr id="11" name="Picture 11"/>
+            <wp:cNvGraphicFramePr>
+              <a:graphicFrameLocks xmlns:a="http://schemas.openxmlformats.org/drawingml/2006/main" noChangeAspect="1"/>
+            </wp:cNvGraphicFramePr>
+            <a:graphic xmlns:a="http://schemas.openxmlformats.org/drawingml/2006/main">
+              <a:graphicData uri="http://schemas.openxmlformats.org/drawingml/2006/picture">
+                <pic:pic xmlns:pic="http://schemas.openxmlformats.org/drawingml/2006/picture">
+                  <pic:nvPicPr>
+                    <pic:cNvPr id="1" name=""/>
+                    <pic:cNvPicPr/>
+                  </pic:nvPicPr>
+                  <pic:blipFill>
+                    <a:blip r:embed="rId16"/>
+                    <a:stretch>
+                      <a:fillRect/>
+                    </a:stretch>
+                  </pic:blipFill>
+                  <pic:spPr>
+                    <a:xfrm>
+                      <a:off x="0" y="0"/>
+                      <a:ext cx="8345065" cy="3181794"/>
+                    </a:xfrm>
+                    <a:prstGeom prst="rect">
+                      <a:avLst/>
+                    </a:prstGeom>
+                  </pic:spPr>
+                </pic:pic>
+              </a:graphicData>
+            </a:graphic>
+          </wp:inline>
+        </w:drawing>
+      </w:r>
+    </w:p>
+    <w:p>
+      <w:pPr>
+        <w:pStyle w:val="NoSpacing"/>
+        <w:numPr>
+          <w:ilvl w:val="0"/>
+          <w:numId w:val="9"/>
+        </w:numPr>
+      </w:pPr>
+      <w:r>
+        <w:t>df = df.drop(columns=['Month Number' , 'Month Name' , 'Year' ])</w:t>
+      </w:r>
+      <w:r>
+        <w:t xml:space="preserve"> </w:t>
+      </w:r>
+      <w:r>
+        <w:sym w:font="Wingdings" w:char="F0E8"/>
+      </w:r>
+      <w:r>
+        <w:t xml:space="preserve"> if you want to drop columns and you want drop single column</w:t>
+      </w:r>
+    </w:p>
+    <w:p>
+      <w:pPr>
+        <w:pStyle w:val="NoSpacing"/>
+        <w:numPr>
+          <w:ilvl w:val="1"/>
+          <w:numId w:val="9"/>
+        </w:numPr>
+      </w:pPr>
+      <w:r>
+        <w:t>df = df.drop(columns=</w:t>
+      </w:r>
+      <w:r>
+        <w:t xml:space="preserve">'Year' </w:t>
+      </w:r>
+      <w:r>
+        <w:t>)</w:t>
+      </w:r>
+      <w:r>
+        <w:t xml:space="preserve"> </w:t>
+      </w:r>
+      <w:r>
+        <w:sym w:font="Wingdings" w:char="F0E8"/>
+      </w:r>
+      <w:r>
+        <w:t xml:space="preserve"> use quotes ‘ ‘ </w:t>
+      </w:r>
+    </w:p>
+    <w:p>
+      <w:pPr>
+        <w:pStyle w:val="NoSpacing"/>
+        <w:numPr>
+          <w:ilvl w:val="0"/>
+          <w:numId w:val="9"/>
+        </w:numPr>
+      </w:pPr>
+      <w:r>
+        <w:t>SAVE THE DATA INTO FILE</w:t>
+      </w:r>
+    </w:p>
+    <w:p>
+      <w:pPr>
+        <w:pStyle w:val="NoSpacing"/>
+        <w:numPr>
+          <w:ilvl w:val="1"/>
+          <w:numId w:val="9"/>
+        </w:numPr>
+        <w:rPr>
+          <w:highlight w:val="yellow"/>
+        </w:rPr>
+      </w:pPr>
+      <w:r>
+        <w:rPr>
+          <w:highlight w:val="yellow"/>
+        </w:rPr>
+        <w:t>df.to_excel</w:t>
+      </w:r>
+      <w:r>
+        <w:rPr>
+          <w:highlight w:val="yellow"/>
+        </w:rPr>
+        <w:t>(“Name”)</w:t>
+      </w:r>
+    </w:p>
+    <w:p>
+      <w:pPr>
+        <w:pStyle w:val="NoSpacing"/>
+        <w:numPr>
+          <w:ilvl w:val="1"/>
+          <w:numId w:val="9"/>
+        </w:numPr>
+      </w:pPr>
+      <w:r>
+        <w:t>df.to_csv</w:t>
+      </w:r>
+      <w:r>
+        <w:t>(“Cleaned_data.csv”)</w:t>
+      </w:r>
+    </w:p>
+    <w:p>
+      <w:pPr>
+        <w:pStyle w:val="NoSpacing"/>
+        <w:numPr>
+          <w:ilvl w:val="1"/>
+          <w:numId w:val="9"/>
+        </w:numPr>
+      </w:pPr>
+      <w:r>
+        <w:t>df.to_json</w:t>
+      </w:r>
+      <w:r>
+        <w:t>(“Cleaned_data.</w:t>
+      </w:r>
+      <w:r>
+        <w:t>json</w:t>
+      </w:r>
+      <w:r>
+        <w:t>”)</w:t>
+      </w:r>
+    </w:p>
+    <w:p>
+      <w:pPr>
+        <w:pStyle w:val="NoSpacing"/>
+        <w:numPr>
+          <w:ilvl w:val="1"/>
+          <w:numId w:val="9"/>
+        </w:numPr>
+      </w:pPr>
+      <w:r>
+        <w:t>df.to_list</w:t>
+      </w:r>
+      <w:r>
+        <w:t>(“Cleaned_data.</w:t>
+      </w:r>
+      <w:r>
+        <w:t>li</w:t>
+      </w:r>
+      <w:r>
+        <w:t>”)</w:t>
+      </w:r>
+    </w:p>
+    <w:p>
+      <w:pPr>
+        <w:pStyle w:val="NoSpacing"/>
+        <w:numPr>
+          <w:ilvl w:val="0"/>
+          <w:numId w:val="9"/>
+        </w:numPr>
+      </w:pPr>
+      <w:r>
+        <w:t>WithOUT INDEX</w:t>
+      </w:r>
+    </w:p>
+    <w:p>
+      <w:pPr>
+        <w:pStyle w:val="NoSpacing"/>
+        <w:numPr>
+          <w:ilvl w:val="1"/>
+          <w:numId w:val="9"/>
+        </w:numPr>
+      </w:pPr>
+      <w:r>
+        <w:t>df.to_csv("Cleaned_Data_0003_Practical.csv" , index =False)</w:t>
+      </w:r>
+      <w:bookmarkStart w:id="0" w:name="_GoBack"/>
+      <w:bookmarkEnd w:id="0"/>
+    </w:p>
+    <w:p>
+      <w:pPr>
+        <w:pStyle w:val="NoSpacing"/>
+        <w:ind w:left="360"/>
+      </w:pPr>
+    </w:p>
+    <w:p>
+      <w:pPr>
+        <w:pStyle w:val="NoSpacing"/>
+        <w:ind w:left="360"/>
+      </w:pPr>
+    </w:p>
     <w:sectPr>
       <w:pgSz w:w="15840" w:h="24480" w:code="3"/>
       <w:pgMar w:top="720" w:right="720" w:bottom="720" w:left="720" w:header="720" w:footer="720" w:gutter="0"/>
@@ -29397,6 +29858,92 @@
     </w:lvl>
   </w:abstractNum>
   <w:abstractNum w:abstractNumId="1" w15:restartNumberingAfterBreak="0">
+    <w:nsid w:val="075F0364"/>
+    <w:multiLevelType w:val="hybridMultilevel"/>
+    <w:tmpl w:val="9A729A60"/>
+    <w:lvl w:ilvl="0" w:tplc="0409000F">
+      <w:start w:val="1"/>
+      <w:numFmt w:val="decimal"/>
+      <w:lvlText w:val="%1."/>
+      <w:lvlJc w:val="left"/>
+      <w:pPr>
+        <w:ind w:left="720" w:hanging="360"/>
+      </w:pPr>
+    </w:lvl>
+    <w:lvl w:ilvl="1" w:tplc="04090019" w:tentative="1">
+      <w:start w:val="1"/>
+      <w:numFmt w:val="lowerLetter"/>
+      <w:lvlText w:val="%2."/>
+      <w:lvlJc w:val="left"/>
+      <w:pPr>
+        <w:ind w:left="1440" w:hanging="360"/>
+      </w:pPr>
+    </w:lvl>
+    <w:lvl w:ilvl="2" w:tplc="0409001B" w:tentative="1">
+      <w:start w:val="1"/>
+      <w:numFmt w:val="lowerRoman"/>
+      <w:lvlText w:val="%3."/>
+      <w:lvlJc w:val="right"/>
+      <w:pPr>
+        <w:ind w:left="2160" w:hanging="180"/>
+      </w:pPr>
+    </w:lvl>
+    <w:lvl w:ilvl="3" w:tplc="0409000F" w:tentative="1">
+      <w:start w:val="1"/>
+      <w:numFmt w:val="decimal"/>
+      <w:lvlText w:val="%4."/>
+      <w:lvlJc w:val="left"/>
+      <w:pPr>
+        <w:ind w:left="2880" w:hanging="360"/>
+      </w:pPr>
+    </w:lvl>
+    <w:lvl w:ilvl="4" w:tplc="04090019" w:tentative="1">
+      <w:start w:val="1"/>
+      <w:numFmt w:val="lowerLetter"/>
+      <w:lvlText w:val="%5."/>
+      <w:lvlJc w:val="left"/>
+      <w:pPr>
+        <w:ind w:left="3600" w:hanging="360"/>
+      </w:pPr>
+    </w:lvl>
+    <w:lvl w:ilvl="5" w:tplc="0409001B" w:tentative="1">
+      <w:start w:val="1"/>
+      <w:numFmt w:val="lowerRoman"/>
+      <w:lvlText w:val="%6."/>
+      <w:lvlJc w:val="right"/>
+      <w:pPr>
+        <w:ind w:left="4320" w:hanging="180"/>
+      </w:pPr>
+    </w:lvl>
+    <w:lvl w:ilvl="6" w:tplc="0409000F" w:tentative="1">
+      <w:start w:val="1"/>
+      <w:numFmt w:val="decimal"/>
+      <w:lvlText w:val="%7."/>
+      <w:lvlJc w:val="left"/>
+      <w:pPr>
+        <w:ind w:left="5040" w:hanging="360"/>
+      </w:pPr>
+    </w:lvl>
+    <w:lvl w:ilvl="7" w:tplc="04090019" w:tentative="1">
+      <w:start w:val="1"/>
+      <w:numFmt w:val="lowerLetter"/>
+      <w:lvlText w:val="%8."/>
+      <w:lvlJc w:val="left"/>
+      <w:pPr>
+        <w:ind w:left="5760" w:hanging="360"/>
+      </w:pPr>
+    </w:lvl>
+    <w:lvl w:ilvl="8" w:tplc="0409001B" w:tentative="1">
+      <w:start w:val="1"/>
+      <w:numFmt w:val="lowerRoman"/>
+      <w:lvlText w:val="%9."/>
+      <w:lvlJc w:val="right"/>
+      <w:pPr>
+        <w:ind w:left="6480" w:hanging="180"/>
+      </w:pPr>
+    </w:lvl>
+  </w:abstractNum>
+  <w:abstractNum w:abstractNumId="2" w15:restartNumberingAfterBreak="0">
     <w:nsid w:val="25CE0EDF"/>
     <w:multiLevelType w:val="hybridMultilevel"/>
     <w:tmpl w:val="1110FF4C"/>
@@ -29509,7 +30056,7 @@
       </w:rPr>
     </w:lvl>
   </w:abstractNum>
-  <w:abstractNum w:abstractNumId="2" w15:restartNumberingAfterBreak="0">
+  <w:abstractNum w:abstractNumId="3" w15:restartNumberingAfterBreak="0">
     <w:nsid w:val="374C16F6"/>
     <w:multiLevelType w:val="hybridMultilevel"/>
     <w:tmpl w:val="B6B021E2"/>
@@ -29622,7 +30169,7 @@
       </w:rPr>
     </w:lvl>
   </w:abstractNum>
-  <w:abstractNum w:abstractNumId="3" w15:restartNumberingAfterBreak="0">
+  <w:abstractNum w:abstractNumId="4" w15:restartNumberingAfterBreak="0">
     <w:nsid w:val="39342E1D"/>
     <w:multiLevelType w:val="hybridMultilevel"/>
     <w:tmpl w:val="9FEC9C24"/>
@@ -29735,7 +30282,7 @@
       </w:rPr>
     </w:lvl>
   </w:abstractNum>
-  <w:abstractNum w:abstractNumId="4" w15:restartNumberingAfterBreak="0">
+  <w:abstractNum w:abstractNumId="5" w15:restartNumberingAfterBreak="0">
     <w:nsid w:val="3C751E78"/>
     <w:multiLevelType w:val="hybridMultilevel"/>
     <w:tmpl w:val="1592D6A8"/>
@@ -29824,7 +30371,7 @@
       </w:pPr>
     </w:lvl>
   </w:abstractNum>
-  <w:abstractNum w:abstractNumId="5" w15:restartNumberingAfterBreak="0">
+  <w:abstractNum w:abstractNumId="6" w15:restartNumberingAfterBreak="0">
     <w:nsid w:val="42200B9F"/>
     <w:multiLevelType w:val="hybridMultilevel"/>
     <w:tmpl w:val="FCD655B8"/>
@@ -29910,7 +30457,7 @@
       </w:pPr>
     </w:lvl>
   </w:abstractNum>
-  <w:abstractNum w:abstractNumId="6" w15:restartNumberingAfterBreak="0">
+  <w:abstractNum w:abstractNumId="7" w15:restartNumberingAfterBreak="0">
     <w:nsid w:val="471775BD"/>
     <w:multiLevelType w:val="hybridMultilevel"/>
     <w:tmpl w:val="271A9436"/>
@@ -30023,7 +30570,7 @@
       </w:rPr>
     </w:lvl>
   </w:abstractNum>
-  <w:abstractNum w:abstractNumId="7" w15:restartNumberingAfterBreak="0">
+  <w:abstractNum w:abstractNumId="8" w15:restartNumberingAfterBreak="0">
     <w:nsid w:val="52F004D3"/>
     <w:multiLevelType w:val="multilevel"/>
     <w:tmpl w:val="84FE70EA"/>
@@ -30136,7 +30683,7 @@
       </w:pPr>
     </w:lvl>
   </w:abstractNum>
-  <w:abstractNum w:abstractNumId="8" w15:restartNumberingAfterBreak="0">
+  <w:abstractNum w:abstractNumId="9" w15:restartNumberingAfterBreak="0">
     <w:nsid w:val="5C951A9E"/>
     <w:multiLevelType w:val="hybridMultilevel"/>
     <w:tmpl w:val="93E89B04"/>
@@ -30249,7 +30796,93 @@
       </w:rPr>
     </w:lvl>
   </w:abstractNum>
-  <w:abstractNum w:abstractNumId="9" w15:restartNumberingAfterBreak="0">
+  <w:abstractNum w:abstractNumId="10" w15:restartNumberingAfterBreak="0">
+    <w:nsid w:val="61507DAE"/>
+    <w:multiLevelType w:val="hybridMultilevel"/>
+    <w:tmpl w:val="B12C64EC"/>
+    <w:lvl w:ilvl="0" w:tplc="0409000F">
+      <w:start w:val="1"/>
+      <w:numFmt w:val="decimal"/>
+      <w:lvlText w:val="%1."/>
+      <w:lvlJc w:val="left"/>
+      <w:pPr>
+        <w:ind w:left="1440" w:hanging="360"/>
+      </w:pPr>
+    </w:lvl>
+    <w:lvl w:ilvl="1" w:tplc="04090019" w:tentative="1">
+      <w:start w:val="1"/>
+      <w:numFmt w:val="lowerLetter"/>
+      <w:lvlText w:val="%2."/>
+      <w:lvlJc w:val="left"/>
+      <w:pPr>
+        <w:ind w:left="2160" w:hanging="360"/>
+      </w:pPr>
+    </w:lvl>
+    <w:lvl w:ilvl="2" w:tplc="0409001B" w:tentative="1">
+      <w:start w:val="1"/>
+      <w:numFmt w:val="lowerRoman"/>
+      <w:lvlText w:val="%3."/>
+      <w:lvlJc w:val="right"/>
+      <w:pPr>
+        <w:ind w:left="2880" w:hanging="180"/>
+      </w:pPr>
+    </w:lvl>
+    <w:lvl w:ilvl="3" w:tplc="0409000F" w:tentative="1">
+      <w:start w:val="1"/>
+      <w:numFmt w:val="decimal"/>
+      <w:lvlText w:val="%4."/>
+      <w:lvlJc w:val="left"/>
+      <w:pPr>
+        <w:ind w:left="3600" w:hanging="360"/>
+      </w:pPr>
+    </w:lvl>
+    <w:lvl w:ilvl="4" w:tplc="04090019" w:tentative="1">
+      <w:start w:val="1"/>
+      <w:numFmt w:val="lowerLetter"/>
+      <w:lvlText w:val="%5."/>
+      <w:lvlJc w:val="left"/>
+      <w:pPr>
+        <w:ind w:left="4320" w:hanging="360"/>
+      </w:pPr>
+    </w:lvl>
+    <w:lvl w:ilvl="5" w:tplc="0409001B" w:tentative="1">
+      <w:start w:val="1"/>
+      <w:numFmt w:val="lowerRoman"/>
+      <w:lvlText w:val="%6."/>
+      <w:lvlJc w:val="right"/>
+      <w:pPr>
+        <w:ind w:left="5040" w:hanging="180"/>
+      </w:pPr>
+    </w:lvl>
+    <w:lvl w:ilvl="6" w:tplc="0409000F" w:tentative="1">
+      <w:start w:val="1"/>
+      <w:numFmt w:val="decimal"/>
+      <w:lvlText w:val="%7."/>
+      <w:lvlJc w:val="left"/>
+      <w:pPr>
+        <w:ind w:left="5760" w:hanging="360"/>
+      </w:pPr>
+    </w:lvl>
+    <w:lvl w:ilvl="7" w:tplc="04090019" w:tentative="1">
+      <w:start w:val="1"/>
+      <w:numFmt w:val="lowerLetter"/>
+      <w:lvlText w:val="%8."/>
+      <w:lvlJc w:val="left"/>
+      <w:pPr>
+        <w:ind w:left="6480" w:hanging="360"/>
+      </w:pPr>
+    </w:lvl>
+    <w:lvl w:ilvl="8" w:tplc="0409001B" w:tentative="1">
+      <w:start w:val="1"/>
+      <w:numFmt w:val="lowerRoman"/>
+      <w:lvlText w:val="%9."/>
+      <w:lvlJc w:val="right"/>
+      <w:pPr>
+        <w:ind w:left="7200" w:hanging="180"/>
+      </w:pPr>
+    </w:lvl>
+  </w:abstractNum>
+  <w:abstractNum w:abstractNumId="11" w15:restartNumberingAfterBreak="0">
     <w:nsid w:val="70F821E9"/>
     <w:multiLevelType w:val="hybridMultilevel"/>
     <w:tmpl w:val="3B7EBC0A"/>
@@ -30338,7 +30971,7 @@
       </w:pPr>
     </w:lvl>
   </w:abstractNum>
-  <w:abstractNum w:abstractNumId="10" w15:restartNumberingAfterBreak="0">
+  <w:abstractNum w:abstractNumId="12" w15:restartNumberingAfterBreak="0">
     <w:nsid w:val="7D0F6DE1"/>
     <w:multiLevelType w:val="hybridMultilevel"/>
     <w:tmpl w:val="479A335E"/>
@@ -30452,37 +31085,43 @@
     </w:lvl>
   </w:abstractNum>
   <w:num w:numId="1">
+    <w:abstractNumId w:val="8"/>
+  </w:num>
+  <w:num w:numId="2">
+    <w:abstractNumId w:val="3"/>
+  </w:num>
+  <w:num w:numId="3">
+    <w:abstractNumId w:val="12"/>
+  </w:num>
+  <w:num w:numId="4">
+    <w:abstractNumId w:val="2"/>
+  </w:num>
+  <w:num w:numId="5">
+    <w:abstractNumId w:val="4"/>
+  </w:num>
+  <w:num w:numId="6">
     <w:abstractNumId w:val="7"/>
   </w:num>
-  <w:num w:numId="2">
-    <w:abstractNumId w:val="2"/>
+  <w:num w:numId="7">
+    <w:abstractNumId w:val="9"/>
   </w:num>
-  <w:num w:numId="3">
-    <w:abstractNumId w:val="10"/>
-  </w:num>
-  <w:num w:numId="4">
-    <w:abstractNumId w:val="1"/>
-  </w:num>
-  <w:num w:numId="5">
-    <w:abstractNumId w:val="3"/>
-  </w:num>
-  <w:num w:numId="6">
+  <w:num w:numId="8">
     <w:abstractNumId w:val="6"/>
   </w:num>
-  <w:num w:numId="7">
-    <w:abstractNumId w:val="8"/>
-  </w:num>
-  <w:num w:numId="8">
-    <w:abstractNumId w:val="5"/>
-  </w:num>
   <w:num w:numId="9">
-    <w:abstractNumId w:val="9"/>
+    <w:abstractNumId w:val="11"/>
   </w:num>
   <w:num w:numId="10">
-    <w:abstractNumId w:val="4"/>
+    <w:abstractNumId w:val="5"/>
   </w:num>
   <w:num w:numId="11">
     <w:abstractNumId w:val="0"/>
+  </w:num>
+  <w:num w:numId="12">
+    <w:abstractNumId w:val="10"/>
+  </w:num>
+  <w:num w:numId="13">
+    <w:abstractNumId w:val="1"/>
   </w:num>
 </w:numbering>
 </file>

</xml_diff>